<commit_message>
fix: embed all 6 chart PNG figures into TEAM 2 RESEARCH PAPER.docx and commit images directory
</commit_message>
<xml_diff>
--- a/TEAM 2 RESEARCH PAPER.docx
+++ b/TEAM 2 RESEARCH PAPER.docx
@@ -515,6 +515,63 @@
     <w:p>
       <w:pPr>
         <w:keepNext/>
+        <w:spacing w:before="80" w:after="40"/>
+        <w:jc w:val="center"/>
+      </w:pPr>
+      <w:r>
+        <w:drawing>
+          <wp:inline xmlns:a="http://schemas.openxmlformats.org/drawingml/2006/main" xmlns:pic="http://schemas.openxmlformats.org/drawingml/2006/picture">
+            <wp:extent cx="3017520" cy="3421121"/>
+            <wp:docPr id="1" name="Picture 1"/>
+            <wp:cNvGraphicFramePr>
+              <a:graphicFrameLocks noChangeAspect="1"/>
+            </wp:cNvGraphicFramePr>
+            <a:graphic>
+              <a:graphicData uri="http://schemas.openxmlformats.org/drawingml/2006/picture">
+                <pic:pic>
+                  <pic:nvPicPr>
+                    <pic:cNvPr id="0" name="system_architecture_diagram.png"/>
+                    <pic:cNvPicPr/>
+                  </pic:nvPicPr>
+                  <pic:blipFill>
+                    <a:blip r:embed="rId9"/>
+                    <a:stretch>
+                      <a:fillRect/>
+                    </a:stretch>
+                  </pic:blipFill>
+                  <pic:spPr>
+                    <a:xfrm>
+                      <a:off x="0" y="0"/>
+                      <a:ext cx="3017520" cy="3421121"/>
+                    </a:xfrm>
+                    <a:prstGeom prst="rect"/>
+                  </pic:spPr>
+                </pic:pic>
+              </a:graphicData>
+            </a:graphic>
+          </wp:inline>
+        </w:drawing>
+      </w:r>
+    </w:p>
+    <w:p>
+      <w:pPr>
+        <w:keepNext/>
+        <w:spacing w:before="80" w:after="40"/>
+        <w:jc w:val="left"/>
+      </w:pPr>
+      <w:r>
+        <w:rPr>
+          <w:rFonts w:ascii="Times New Roman" w:hAnsi="Times New Roman"/>
+          <w:b/>
+          <w:color w:val="002B49"/>
+          <w:sz w:val="17"/>
+        </w:rPr>
+        <w:t>Figure 1. Architectural blueprint of the multi-stage staged RAG pipeline (S8) across dual-hop retrieval, cross-encoder reranking, and dual reader parameter scaling.</w:t>
+      </w:r>
+    </w:p>
+    <w:p>
+      <w:pPr>
+        <w:keepNext/>
         <w:spacing w:before="160" w:after="50"/>
       </w:pPr>
       <w:r>
@@ -3671,6 +3728,63 @@
     </w:p>
     <w:p>
       <w:pPr>
+        <w:keepNext/>
+        <w:spacing w:before="80" w:after="40"/>
+        <w:jc w:val="center"/>
+      </w:pPr>
+      <w:r>
+        <w:drawing>
+          <wp:inline xmlns:a="http://schemas.openxmlformats.org/drawingml/2006/main" xmlns:pic="http://schemas.openxmlformats.org/drawingml/2006/picture">
+            <wp:extent cx="3017520" cy="1794201"/>
+            <wp:docPr id="2" name="Picture 2"/>
+            <wp:cNvGraphicFramePr>
+              <a:graphicFrameLocks noChangeAspect="1"/>
+            </wp:cNvGraphicFramePr>
+            <a:graphic>
+              <a:graphicData uri="http://schemas.openxmlformats.org/drawingml/2006/picture">
+                <pic:pic>
+                  <pic:nvPicPr>
+                    <pic:cNvPr id="0" name="fig1_ablation_barplot.png"/>
+                    <pic:cNvPicPr/>
+                  </pic:nvPicPr>
+                  <pic:blipFill>
+                    <a:blip r:embed="rId10"/>
+                    <a:stretch>
+                      <a:fillRect/>
+                    </a:stretch>
+                  </pic:blipFill>
+                  <pic:spPr>
+                    <a:xfrm>
+                      <a:off x="0" y="0"/>
+                      <a:ext cx="3017520" cy="1794201"/>
+                    </a:xfrm>
+                    <a:prstGeom prst="rect"/>
+                  </pic:spPr>
+                </pic:pic>
+              </a:graphicData>
+            </a:graphic>
+          </wp:inline>
+        </w:drawing>
+      </w:r>
+    </w:p>
+    <w:p>
+      <w:pPr>
+        <w:keepNext/>
+        <w:spacing w:before="80" w:after="40"/>
+        <w:jc w:val="left"/>
+      </w:pPr>
+      <w:r>
+        <w:rPr>
+          <w:rFonts w:ascii="Times New Roman" w:hAnsi="Times New Roman"/>
+          <w:b/>
+          <w:color w:val="002B49"/>
+          <w:sz w:val="17"/>
+        </w:rPr>
+        <w:t>Figure 2. AllSF@5 retrieval coverage across ablation configurations (untruncated 0-100% axis).</w:t>
+      </w:r>
+    </w:p>
+    <w:p>
+      <w:pPr>
         <w:spacing w:before="0" w:after="80" w:line="259" w:lineRule="auto"/>
         <w:jc w:val="both"/>
       </w:pPr>
@@ -13389,6 +13503,63 @@
     </w:p>
     <w:p>
       <w:pPr>
+        <w:keepNext/>
+        <w:spacing w:before="80" w:after="40"/>
+        <w:jc w:val="center"/>
+      </w:pPr>
+      <w:r>
+        <w:drawing>
+          <wp:inline xmlns:a="http://schemas.openxmlformats.org/drawingml/2006/main" xmlns:pic="http://schemas.openxmlformats.org/drawingml/2006/picture">
+            <wp:extent cx="3017520" cy="1916533"/>
+            <wp:docPr id="3" name="Picture 3"/>
+            <wp:cNvGraphicFramePr>
+              <a:graphicFrameLocks noChangeAspect="1"/>
+            </wp:cNvGraphicFramePr>
+            <a:graphic>
+              <a:graphicData uri="http://schemas.openxmlformats.org/drawingml/2006/picture">
+                <pic:pic>
+                  <pic:nvPicPr>
+                    <pic:cNvPr id="0" name="fig3_depth_latency_tradeoff.png"/>
+                    <pic:cNvPicPr/>
+                  </pic:nvPicPr>
+                  <pic:blipFill>
+                    <a:blip r:embed="rId11"/>
+                    <a:stretch>
+                      <a:fillRect/>
+                    </a:stretch>
+                  </pic:blipFill>
+                  <pic:spPr>
+                    <a:xfrm>
+                      <a:off x="0" y="0"/>
+                      <a:ext cx="3017520" cy="1916533"/>
+                    </a:xfrm>
+                    <a:prstGeom prst="rect"/>
+                  </pic:spPr>
+                </pic:pic>
+              </a:graphicData>
+            </a:graphic>
+          </wp:inline>
+        </w:drawing>
+      </w:r>
+    </w:p>
+    <w:p>
+      <w:pPr>
+        <w:keepNext/>
+        <w:spacing w:before="80" w:after="40"/>
+        <w:jc w:val="left"/>
+      </w:pPr>
+      <w:r>
+        <w:rPr>
+          <w:rFonts w:ascii="Times New Roman" w:hAnsi="Times New Roman"/>
+          <w:b/>
+          <w:color w:val="002B49"/>
+          <w:sz w:val="17"/>
+        </w:rPr>
+        <w:t>Figure 3. Candidate depth recall trajectory for unreranked hybrid retrieval across K ∈ {5, 10, 25, 50}.</w:t>
+      </w:r>
+    </w:p>
+    <w:p>
+      <w:pPr>
         <w:spacing w:before="0" w:after="80" w:line="259" w:lineRule="auto"/>
         <w:jc w:val="both"/>
       </w:pPr>
@@ -14249,6 +14420,63 @@
           <w:sz w:val="15"/>
         </w:rPr>
         <w:t>Note: Sum of Hop 1 (438) + Hop 2 Rescued (32) = 470 pool capture. Truncation loss drops pool to 428 final hits.</w:t>
+      </w:r>
+    </w:p>
+    <w:p>
+      <w:pPr>
+        <w:keepNext/>
+        <w:spacing w:before="80" w:after="40"/>
+        <w:jc w:val="center"/>
+      </w:pPr>
+      <w:r>
+        <w:drawing>
+          <wp:inline xmlns:a="http://schemas.openxmlformats.org/drawingml/2006/main" xmlns:pic="http://schemas.openxmlformats.org/drawingml/2006/picture">
+            <wp:extent cx="3017520" cy="2517454"/>
+            <wp:docPr id="4" name="Picture 4"/>
+            <wp:cNvGraphicFramePr>
+              <a:graphicFrameLocks noChangeAspect="1"/>
+            </wp:cNvGraphicFramePr>
+            <a:graphic>
+              <a:graphicData uri="http://schemas.openxmlformats.org/drawingml/2006/picture">
+                <pic:pic>
+                  <pic:nvPicPr>
+                    <pic:cNvPr id="0" name="fig2_paired_contingency_matrix.png"/>
+                    <pic:cNvPicPr/>
+                  </pic:nvPicPr>
+                  <pic:blipFill>
+                    <a:blip r:embed="rId12"/>
+                    <a:stretch>
+                      <a:fillRect/>
+                    </a:stretch>
+                  </pic:blipFill>
+                  <pic:spPr>
+                    <a:xfrm>
+                      <a:off x="0" y="0"/>
+                      <a:ext cx="3017520" cy="2517454"/>
+                    </a:xfrm>
+                    <a:prstGeom prst="rect"/>
+                  </pic:spPr>
+                </pic:pic>
+              </a:graphicData>
+            </a:graphic>
+          </wp:inline>
+        </w:drawing>
+      </w:r>
+    </w:p>
+    <w:p>
+      <w:pPr>
+        <w:keepNext/>
+        <w:spacing w:before="80" w:after="40"/>
+        <w:jc w:val="left"/>
+      </w:pPr>
+      <w:r>
+        <w:rPr>
+          <w:rFonts w:ascii="Times New Roman" w:hAnsi="Times New Roman"/>
+          <w:b/>
+          <w:color w:val="002B49"/>
+          <w:sz w:val="17"/>
+        </w:rPr>
+        <w:t>Figure 4. Paired 2×2 evidence contingency matrix between S8 Staged and S5_Ctrl Pool-50 on AllSF@5.</w:t>
       </w:r>
     </w:p>
     <w:p>
@@ -15447,6 +15675,63 @@
     </w:p>
     <w:p>
       <w:pPr>
+        <w:keepNext/>
+        <w:spacing w:before="80" w:after="40"/>
+        <w:jc w:val="center"/>
+      </w:pPr>
+      <w:r>
+        <w:drawing>
+          <wp:inline xmlns:a="http://schemas.openxmlformats.org/drawingml/2006/main" xmlns:pic="http://schemas.openxmlformats.org/drawingml/2006/picture">
+            <wp:extent cx="3017520" cy="1790864"/>
+            <wp:docPr id="5" name="Picture 5"/>
+            <wp:cNvGraphicFramePr>
+              <a:graphicFrameLocks noChangeAspect="1"/>
+            </wp:cNvGraphicFramePr>
+            <a:graphic>
+              <a:graphicData uri="http://schemas.openxmlformats.org/drawingml/2006/picture">
+                <pic:pic>
+                  <pic:nvPicPr>
+                    <pic:cNvPr id="0" name="fig4_noise_decay_curves.png"/>
+                    <pic:cNvPicPr/>
+                  </pic:nvPicPr>
+                  <pic:blipFill>
+                    <a:blip r:embed="rId13"/>
+                    <a:stretch>
+                      <a:fillRect/>
+                    </a:stretch>
+                  </pic:blipFill>
+                  <pic:spPr>
+                    <a:xfrm>
+                      <a:off x="0" y="0"/>
+                      <a:ext cx="3017520" cy="1790864"/>
+                    </a:xfrm>
+                    <a:prstGeom prst="rect"/>
+                  </pic:spPr>
+                </pic:pic>
+              </a:graphicData>
+            </a:graphic>
+          </wp:inline>
+        </w:drawing>
+      </w:r>
+    </w:p>
+    <w:p>
+      <w:pPr>
+        <w:keepNext/>
+        <w:spacing w:before="80" w:after="40"/>
+        <w:jc w:val="left"/>
+      </w:pPr>
+      <w:r>
+        <w:rPr>
+          <w:rFonts w:ascii="Times New Roman" w:hAnsi="Times New Roman"/>
+          <w:b/>
+          <w:color w:val="002B49"/>
+          <w:sz w:val="17"/>
+        </w:rPr>
+        <w:t>Figure 5. Downstream Exact Match and F1 score scaling across 3B and 7B reader generators.</w:t>
+      </w:r>
+    </w:p>
+    <w:p>
+      <w:pPr>
         <w:spacing w:before="0" w:after="80" w:line="259" w:lineRule="auto"/>
         <w:jc w:val="both"/>
       </w:pPr>
@@ -16999,6 +17284,63 @@
           <w:sz w:val="15"/>
         </w:rPr>
         <w:t>Note: Evaluated under single-annotator blind verification. Categories are mutually exclusive and sum to 100%.</w:t>
+      </w:r>
+    </w:p>
+    <w:p>
+      <w:pPr>
+        <w:keepNext/>
+        <w:spacing w:before="80" w:after="40"/>
+        <w:jc w:val="center"/>
+      </w:pPr>
+      <w:r>
+        <w:drawing>
+          <wp:inline xmlns:a="http://schemas.openxmlformats.org/drawingml/2006/main" xmlns:pic="http://schemas.openxmlformats.org/drawingml/2006/picture">
+            <wp:extent cx="3017520" cy="2300352"/>
+            <wp:docPr id="6" name="Picture 6"/>
+            <wp:cNvGraphicFramePr>
+              <a:graphicFrameLocks noChangeAspect="1"/>
+            </wp:cNvGraphicFramePr>
+            <a:graphic>
+              <a:graphicData uri="http://schemas.openxmlformats.org/drawingml/2006/picture">
+                <pic:pic>
+                  <pic:nvPicPr>
+                    <pic:cNvPr id="0" name="fig5_evidence_discovery_curves.png"/>
+                    <pic:cNvPicPr/>
+                  </pic:nvPicPr>
+                  <pic:blipFill>
+                    <a:blip r:embed="rId14"/>
+                    <a:stretch>
+                      <a:fillRect/>
+                    </a:stretch>
+                  </pic:blipFill>
+                  <pic:spPr>
+                    <a:xfrm>
+                      <a:off x="0" y="0"/>
+                      <a:ext cx="3017520" cy="2300352"/>
+                    </a:xfrm>
+                    <a:prstGeom prst="rect"/>
+                  </pic:spPr>
+                </pic:pic>
+              </a:graphicData>
+            </a:graphic>
+          </wp:inline>
+        </w:drawing>
+      </w:r>
+    </w:p>
+    <w:p>
+      <w:pPr>
+        <w:keepNext/>
+        <w:spacing w:before="80" w:after="40"/>
+        <w:jc w:val="left"/>
+      </w:pPr>
+      <w:r>
+        <w:rPr>
+          <w:rFonts w:ascii="Times New Roman" w:hAnsi="Times New Roman"/>
+          <w:b/>
+          <w:color w:val="002B49"/>
+          <w:sz w:val="17"/>
+        </w:rPr>
+        <w:t>Figure 6. Supporting facts recall depth curves across Bridge (N=404) and Comparison (N=96) subgroups.</w:t>
       </w:r>
     </w:p>
     <w:p>

</xml_diff>